<commit_message>
Update AnyBank Digital Portal Design Document
</commit_message>
<xml_diff>
--- a/design-review/AnyBank Digital Portal Design Document.docx
+++ b/design-review/AnyBank Digital Portal Design Document.docx
@@ -8,10 +8,7 @@
       </w:pPr>
       <w:bookmarkStart w:id="0" w:name="X3eb7b3078aceae97341b4448a5c44b44568ee28"/>
       <w:r>
-        <w:t>AnyBank</w:t>
-      </w:r>
-      <w:r>
-        <w:t xml:space="preserve"> Digital Portal — System Design Document</w:t>
+        <w:t>AnyBank Digital Portal — System Design Document</w:t>
       </w:r>
     </w:p>
     <w:p>
@@ -88,10 +85,7 @@
               <w:pStyle w:val="Compact"/>
             </w:pPr>
             <w:r>
-              <w:t>AnyBank</w:t>
-            </w:r>
-            <w:r>
-              <w:t xml:space="preserve"> Digital Banking Portal</w:t>
+              <w:t>AnyBank Digital Banking Portal</w:t>
             </w:r>
           </w:p>
         </w:tc>
@@ -175,7 +169,16 @@
               <w:pStyle w:val="Compact"/>
             </w:pPr>
             <w:r>
-              <w:t>February 4, 2026</w:t>
+              <w:t>April</w:t>
+            </w:r>
+            <w:r>
+              <w:t xml:space="preserve"> </w:t>
+            </w:r>
+            <w:r>
+              <w:t>25</w:t>
+            </w:r>
+            <w:r>
+              <w:t>, 2026</w:t>
             </w:r>
           </w:p>
         </w:tc>
@@ -239,7 +242,7 @@
     </w:tbl>
     <w:p>
       <w:r>
-        <w:pict w14:anchorId="05ADC08A">
+        <w:pict w14:anchorId="2951E3AF">
           <v:rect id="Horizontal Line 1" o:spid="_x0000_s1033" alt="" style="width:468pt;height:1.1pt;visibility:visible;mso-wrap-style:square;mso-width-percent:0;mso-height-percent:0;mso-left-percent:-10001;mso-top-percent:-10001;mso-position-horizontal:absolute;mso-position-horizontal-relative:char;mso-position-vertical:absolute;mso-position-vertical-relative:line;mso-width-percent:0;mso-height-percent:0;mso-left-percent:-10001;mso-top-percent:-10001;v-text-anchor:top" filled="f">
             <o:lock v:ext="edit" rotation="t" aspectratio="t" verticies="t" text="t" shapetype="t"/>
             <w10:anchorlock/>
@@ -283,7 +286,7 @@
     </w:p>
     <w:p>
       <w:r>
-        <w:pict w14:anchorId="5DCC402E">
+        <w:pict w14:anchorId="3CD87BB2">
           <v:rect id="Horizontal Line 2" o:spid="_x0000_s1032" alt="" style="width:468pt;height:1.1pt;visibility:visible;mso-wrap-style:square;mso-width-percent:0;mso-height-percent:0;mso-left-percent:-10001;mso-top-percent:-10001;mso-position-horizontal:absolute;mso-position-horizontal-relative:char;mso-position-vertical:absolute;mso-position-vertical-relative:line;mso-width-percent:0;mso-height-percent:0;mso-left-percent:-10001;mso-top-percent:-10001;v-text-anchor:top" filled="f">
             <o:lock v:ext="edit" rotation="t" aspectratio="t" verticies="t" text="t" shapetype="t"/>
             <w10:anchorlock/>
@@ -1124,7 +1127,7 @@
     </w:p>
     <w:p>
       <w:r>
-        <w:pict w14:anchorId="0C935061">
+        <w:pict w14:anchorId="6D506E39">
           <v:rect id="Horizontal Line 3" o:spid="_x0000_s1031" alt="" style="width:468pt;height:1.1pt;visibility:visible;mso-wrap-style:square;mso-width-percent:0;mso-height-percent:0;mso-left-percent:-10001;mso-top-percent:-10001;mso-position-horizontal:absolute;mso-position-horizontal-relative:char;mso-position-vertical:absolute;mso-position-vertical-relative:line;mso-width-percent:0;mso-height-percent:0;mso-left-percent:-10001;mso-top-percent:-10001;v-text-anchor:top" filled="f">
             <o:lock v:ext="edit" rotation="t" aspectratio="t" verticies="t" text="t" shapetype="t"/>
             <w10:anchorlock/>
@@ -1819,7 +1822,7 @@
     </w:p>
     <w:p>
       <w:r>
-        <w:pict w14:anchorId="65F6506A">
+        <w:pict w14:anchorId="38142C99">
           <v:rect id="Horizontal Line 4" o:spid="_x0000_s1030" alt="" style="width:468pt;height:1.1pt;visibility:visible;mso-wrap-style:square;mso-width-percent:0;mso-height-percent:0;mso-left-percent:-10001;mso-top-percent:-10001;mso-position-horizontal:absolute;mso-position-horizontal-relative:char;mso-position-vertical:absolute;mso-position-vertical-relative:line;mso-width-percent:0;mso-height-percent:0;mso-left-percent:-10001;mso-top-percent:-10001;v-text-anchor:top" filled="f">
             <o:lock v:ext="edit" rotation="t" aspectratio="t" verticies="t" text="t" shapetype="t"/>
             <w10:anchorlock/>
@@ -2148,7 +2151,7 @@
     </w:p>
     <w:p>
       <w:r>
-        <w:pict w14:anchorId="7403175F">
+        <w:pict w14:anchorId="3BD4E514">
           <v:rect id="Horizontal Line 5" o:spid="_x0000_s1029" alt="" style="width:468pt;height:1.1pt;visibility:visible;mso-wrap-style:square;mso-width-percent:0;mso-height-percent:0;mso-left-percent:-10001;mso-top-percent:-10001;mso-position-horizontal:absolute;mso-position-horizontal-relative:char;mso-position-vertical:absolute;mso-position-vertical-relative:line;mso-width-percent:0;mso-height-percent:0;mso-left-percent:-10001;mso-top-percent:-10001;v-text-anchor:top" filled="f">
             <o:lock v:ext="edit" rotation="t" aspectratio="t" verticies="t" text="t" shapetype="t"/>
             <w10:anchorlock/>
@@ -2405,7 +2408,7 @@
     </w:p>
     <w:p>
       <w:r>
-        <w:pict w14:anchorId="44966A47">
+        <w:pict w14:anchorId="6D757CC3">
           <v:rect id="Horizontal Line 6" o:spid="_x0000_s1028" alt="" style="width:468pt;height:1.1pt;visibility:visible;mso-wrap-style:square;mso-width-percent:0;mso-height-percent:0;mso-left-percent:-10001;mso-top-percent:-10001;mso-position-horizontal:absolute;mso-position-horizontal-relative:char;mso-position-vertical:absolute;mso-position-vertical-relative:line;mso-width-percent:0;mso-height-percent:0;mso-left-percent:-10001;mso-top-percent:-10001;v-text-anchor:top" filled="f">
             <o:lock v:ext="edit" rotation="t" aspectratio="t" verticies="t" text="t" shapetype="t"/>
             <w10:anchorlock/>
@@ -2478,7 +2481,7 @@
     </w:p>
     <w:p>
       <w:r>
-        <w:pict w14:anchorId="31988F0D">
+        <w:pict w14:anchorId="4776756E">
           <v:rect id="Horizontal Line 7" o:spid="_x0000_s1027" alt="" style="width:468pt;height:1.1pt;visibility:visible;mso-wrap-style:square;mso-width-percent:0;mso-height-percent:0;mso-left-percent:-10001;mso-top-percent:-10001;mso-position-horizontal:absolute;mso-position-horizontal-relative:char;mso-position-vertical:absolute;mso-position-vertical-relative:line;mso-width-percent:0;mso-height-percent:0;mso-left-percent:-10001;mso-top-percent:-10001;v-text-anchor:top" filled="f">
             <o:lock v:ext="edit" rotation="t" aspectratio="t" verticies="t" text="t" shapetype="t"/>
             <w10:anchorlock/>
@@ -2584,7 +2587,7 @@
     </w:p>
     <w:p>
       <w:r>
-        <w:pict w14:anchorId="5D127B3A">
+        <w:pict w14:anchorId="366BD369">
           <v:rect id="Horizontal Line 8" o:spid="_x0000_s1026" alt="" style="width:468pt;height:1.1pt;visibility:visible;mso-wrap-style:square;mso-width-percent:0;mso-height-percent:0;mso-left-percent:-10001;mso-top-percent:-10001;mso-position-horizontal:absolute;mso-position-horizontal-relative:char;mso-position-vertical:absolute;mso-position-vertical-relative:line;mso-width-percent:0;mso-height-percent:0;mso-left-percent:-10001;mso-top-percent:-10001;v-text-anchor:top" filled="f">
             <o:lock v:ext="edit" rotation="t" aspectratio="t" verticies="t" text="t" shapetype="t"/>
             <w10:anchorlock/>

</xml_diff>